<commit_message>
Porta il disegno del back-office alla v0.7
Nuovo capitolo sul codice di sessione verso ANSC: il bottone OTP e' della
shell, sempre disponibile, con i suoi quattro stati e il percorso di
immissione in cinque schermate. Allineati i quattro punti della v0.6 che
lo descrivevano come un distintivo del micro-frontend; BO-15 si chiude.

Le cinque immagini del percorso non sono ancora arrivate: al loro posto
ci sono segnaposto, da sostituire con sostituisci_immagine() quando
arrivano, senza rigenerare il documento.

Co-Authored-By: Claude Opus 5 (1M context) <noreply@anthropic.com>
</commit_message>
<xml_diff>
--- a/Documenti finali/DISEGNO_Back-Office_ANSC_v0.5.docx
+++ b/Documenti finali/DISEGNO_Back-Office_ANSC_v0.5.docx
@@ -9,6 +9,12 @@
           <w:lang w:val="it-IT"/>
         </w:rPr>
       </w:pPr>
+      <w:r>
+        <w:rPr>
+          <w:lang w:val="it-IT"/>
+        </w:rPr>
+        <w:t>“</w:t>
+      </w:r>
     </w:p>
     <w:p>
       <w:pPr>
@@ -1832,6 +1838,7 @@
                 <w:szCs w:val="20"/>
                 <w:lang w:val="it-IT"/>
               </w:rPr>
+              <w:lastRenderedPageBreak/>
               <w:t>29/09/2026</w:t>
             </w:r>
           </w:p>
@@ -11687,51 +11694,6 @@
         </w:rPr>
         <w:t>Header e footer appartengono, in questa ipotesi, alla shell, seguono il design system di Roma Capitale e valgono uguali per ogni applicazione dell’ente: è la scelta che garantisce all’operatore di trovare le stesse informazioni nello stesso posto quando passa da un applicativo all’altro. Il back-office vi contribuisce soltanto la parte contestuale. Questo capitolo ne specifica il contenuto in forma di requisito verso la shell.</w:t>
       </w:r>
-      <w:r>
-        <w:rPr>
-          <w:lang w:val="it-IT"/>
-        </w:rPr>
-      </w:r>
-      <w:r>
-        <w:rPr>
-          <w:lang w:val="it-IT"/>
-        </w:rPr>
-      </w:r>
-      <w:r>
-        <w:rPr>
-          <w:lang w:val="it-IT"/>
-        </w:rPr>
-      </w:r>
-      <w:r>
-        <w:rPr>
-          <w:bCs/>
-          <w:lang w:val="it-IT"/>
-        </w:rPr>
-      </w:r>
-      <w:r>
-        <w:rPr>
-          <w:rStyle w:val="Rimandonotaapidipagina"/>
-          <w:bCs/>
-          <w:lang w:val="it-IT"/>
-        </w:rPr>
-      </w:r>
-      <w:r>
-        <w:rPr>
-          <w:bCs/>
-          <w:lang w:val="it-IT"/>
-        </w:rPr>
-      </w:r>
-      <w:r>
-        <w:rPr>
-          <w:bCs/>
-          <w:lang w:val="it-IT"/>
-        </w:rPr>
-      </w:r>
-      <w:r>
-        <w:rPr>
-          <w:lang w:val="it-IT"/>
-        </w:rPr>
-      </w:r>
     </w:p>
     <w:p>
       <w:pPr>
@@ -11787,9 +11749,6 @@
         <w:jc w:val="both"/>
       </w:pPr>
       <w:r>
-        <w:rPr>
-          <w:b w:val="0"/>
-        </w:rPr>
         <w:t xml:space="preserve">La cornice si compone di tre bande. La </w:t>
       </w:r>
       <w:r>
@@ -11799,9 +11758,6 @@
         <w:t>barra di servizio</w:t>
       </w:r>
       <w:r>
-        <w:rPr>
-          <w:b w:val="0"/>
-        </w:rPr>
         <w:t xml:space="preserve"> porta la preferenza di layout a sinistra e l’utente a destra, con il menu del profilo. La </w:t>
       </w:r>
       <w:r>
@@ -11811,9 +11767,6 @@
         <w:t>testata istituzionale</w:t>
       </w:r>
       <w:r>
-        <w:rPr>
-          <w:b w:val="0"/>
-        </w:rPr>
         <w:t xml:space="preserve"> porta il marchio ROMA, lo stemma e la dicitura «Roma Capitale». Il </w:t>
       </w:r>
       <w:r>
@@ -11823,9 +11776,6 @@
         <w:t>piè di pagina</w:t>
       </w:r>
       <w:r>
-        <w:rPr>
-          <w:b w:val="0"/>
-        </w:rPr>
         <w:t xml:space="preserve"> raccoglie contatti, menu, canali e riferimenti legali su fondo scuro. Nessuna delle tre è disegnata dal micro-frontend.</w:t>
       </w:r>
     </w:p>
@@ -11834,9 +11784,6 @@
         <w:jc w:val="both"/>
       </w:pPr>
       <w:r>
-        <w:rPr>
-          <w:b w:val="0"/>
-        </w:rPr>
         <w:t xml:space="preserve">⚠️ </w:t>
       </w:r>
       <w:r>
@@ -11846,9 +11793,6 @@
         <w:t>Due elementi che questo documento raccomandava non compaiono nella cornice, ed è una scelta.</w:t>
       </w:r>
       <w:r>
-        <w:rPr>
-          <w:b w:val="0"/>
-        </w:rPr>
         <w:t xml:space="preserve"> L’indicazione dell’ambiente e la versione di build non sono previste dal design system istituzionale, e il committente non intende modificarlo. Restano qui come raccomandazione motivata — le ragioni sono nelle tabelle che seguono — e non come elemento disegnato, finché non siano concordate con chi governa il design system.</w:t>
       </w:r>
     </w:p>
@@ -11883,6 +11827,7 @@
         <w:rPr>
           <w:lang w:val="it-IT"/>
         </w:rPr>
+        <w:lastRenderedPageBreak/>
         <w:t>Che cosa deve contenere la testata</w:t>
       </w:r>
       <w:bookmarkEnd w:id="11"/>
@@ -12253,9 +12198,6 @@
               </w:rPr>
             </w:pPr>
             <w:r>
-              <w:rPr>
-                <w:b w:val="0"/>
-              </w:rPr>
               <w:t xml:space="preserve">⚠️ DEV, COLLAUDO o ESERCIZIO. </w:t>
             </w:r>
             <w:r>
@@ -12265,9 +12207,6 @@
               <w:t>Oggi non è previsto dal design system e non è disegnato</w:t>
             </w:r>
             <w:r>
-              <w:rPr>
-                <w:b w:val="0"/>
-              </w:rPr>
               <w:t>, per scelta del committente. La raccomandazione resta, perché è l’elemento che impedisce l’errore più costoso: operare in esercizio credendo di essere in collaudo. Negli ambienti diversi dall’esercizio dovrebbe essere impossibile da non vedere, e il colore da solo non basta — non è accessibile.</w:t>
             </w:r>
           </w:p>
@@ -12473,7 +12412,6 @@
                 <w:sz w:val="17"/>
                 <w:lang w:val="it-IT"/>
               </w:rPr>
-              <w:lastRenderedPageBreak/>
               <w:t>Utente</w:t>
             </w:r>
           </w:p>
@@ -13033,9 +12971,6 @@
               </w:rPr>
             </w:pPr>
             <w:r>
-              <w:rPr>
-                <w:b w:val="0"/>
-              </w:rPr>
               <w:t xml:space="preserve">⚠️ </w:t>
             </w:r>
             <w:r>
@@ -13045,9 +12980,6 @@
               <w:t>Oggi non previsti dal design system e non disegnati.</w:t>
             </w:r>
             <w:r>
-              <w:rPr>
-                <w:b w:val="0"/>
-              </w:rPr>
               <w:t xml:space="preserve"> Durante un aggiornamento progressivo convivono due versioni dell’applicazione, e un difetto segnalato da un operatore è irriproducibile se non si sa quale stesse usando: è il primo dato che l’assistenza chiede.</w:t>
             </w:r>
           </w:p>
@@ -13197,6 +13129,7 @@
         <w:rPr>
           <w:lang w:val="it-IT"/>
         </w:rPr>
+        <w:lastRenderedPageBreak/>
         <w:br w:type="page"/>
       </w:r>
     </w:p>
@@ -13205,9 +13138,7 @@
         <w:jc w:val="both"/>
       </w:pPr>
       <w:r>
-        <w:rPr>
-          <w:b w:val="0"/>
-        </w:rPr>
+        <w:lastRenderedPageBreak/>
         <w:t xml:space="preserve">⚠️ </w:t>
       </w:r>
       <w:r>
@@ -13217,9 +13148,6 @@
         <w:t>Dove sta il distintivo della sessione, e dove andrà.</w:t>
       </w:r>
       <w:r>
-        <w:rPr>
-          <w:b w:val="0"/>
-        </w:rPr>
         <w:t xml:space="preserve"> Oggi è accanto al titolo della pagina, cioè dentro la fascia che il micro-frontend disegna: è il punto più vicino alle azioni che la sessione abilita. È però in corso di predisposizione, a livello di shell, </w:t>
       </w:r>
       <w:r>
@@ -13229,9 +13157,6 @@
         <w:t>un’area dedicata sotto la testata</w:t>
       </w:r>
       <w:r>
-        <w:rPr>
-          <w:b w:val="0"/>
-        </w:rPr>
         <w:t>: quando sarà disponibile il distintivo vi si trasferirà, guadagnando la stessa posizione in tutte le applicazioni dell’ente. Il disegno non cambia, cambia chi lo ospita.</w:t>
       </w:r>
     </w:p>
@@ -13240,9 +13165,6 @@
         <w:jc w:val="both"/>
       </w:pPr>
       <w:r>
-        <w:rPr>
-          <w:b w:val="0"/>
-        </w:rPr>
         <w:t xml:space="preserve">Alla scadenza la sessione </w:t>
       </w:r>
       <w:r>
@@ -13252,9 +13174,6 @@
         <w:t>non si rinnova da sola</w:t>
       </w:r>
       <w:r>
-        <w:rPr>
-          <w:b w:val="0"/>
-        </w:rPr>
         <w:t xml:space="preserve">: le azioni verso ANSC si disabilitano e l’ufficiale deve acquisire un nuovo codice sulla web app di ANSC e consegnarlo di nuovo. Sotto la soglia di guardia il distintivo cambia aspetto e invita a rinnovare </w:t>
       </w:r>
       <w:r>
@@ -13264,9 +13183,6 @@
         <w:t>prima</w:t>
       </w:r>
       <w:r>
-        <w:rPr>
-          <w:b w:val="0"/>
-        </w:rPr>
         <w:t xml:space="preserve"> di iniziare una sequenza lunga, che è l’unico modo per non trovarsi interrotti a metà.</w:t>
       </w:r>
     </w:p>
@@ -13283,7 +13199,6 @@
         <w:rPr>
           <w:lang w:val="it-IT"/>
         </w:rPr>
-        <w:lastRenderedPageBreak/>
         <w:t>Il registro delle pagine e del menu</w:t>
       </w:r>
       <w:bookmarkEnd w:id="15"/>
@@ -13668,6 +13583,7 @@
         <w:rPr>
           <w:lang w:val="it-IT"/>
         </w:rPr>
+        <w:lastRenderedPageBreak/>
         <w:t>I</w:t>
       </w:r>
       <w:r>
@@ -13858,7 +13774,6 @@
           <w:rFonts w:ascii="Courier New" w:hAnsi="Courier New"/>
           <w:sz w:val="16"/>
         </w:rPr>
-        <w:lastRenderedPageBreak/>
         <w:t xml:space="preserve">  </w:t>
       </w:r>
       <w:r>
@@ -14506,6 +14421,7 @@
           <w:rFonts w:ascii="Courier New" w:hAnsi="Courier New"/>
           <w:sz w:val="16"/>
         </w:rPr>
+        <w:lastRenderedPageBreak/>
         <w:t>CREATE TABLE ANSC_USR.ANSC_CFG_PAGINA_ABILITAZ (</w:t>
       </w:r>
     </w:p>
@@ -14781,7 +14697,6 @@
           <w:rFonts w:ascii="Courier New" w:hAnsi="Courier New"/>
           <w:sz w:val="16"/>
         </w:rPr>
-        <w:lastRenderedPageBreak/>
         <w:t xml:space="preserve">  CONSTRAINT CK_ansc_cfg_abilitaz_coer</w:t>
       </w:r>
     </w:p>
@@ -15238,6 +15153,7 @@
           <w:bCs/>
           <w:lang w:val="it-IT"/>
         </w:rPr>
+        <w:lastRenderedPageBreak/>
         <w:t>Lo stato dell’applicazione</w:t>
       </w:r>
       <w:r>
@@ -15376,7 +15292,6 @@
         <w:rPr>
           <w:lang w:val="it-IT"/>
         </w:rPr>
-        <w:lastRenderedPageBreak/>
         <w:t>Il risultato è memorizzato per la durata della sessione del browser e riletto a ogni accesso, così una modifica dal back-office si vede subito senza costringere a una richiesta per ogni cambio di pagina.</w:t>
       </w:r>
     </w:p>
@@ -16890,7 +16805,7 @@
           <w:rStyle w:val="Rimandonotaapidipagina"/>
           <w:lang w:val="it-IT"/>
         </w:rPr>
-        <w:footnoteReference w:id="4"/>
+        <w:footnoteReference w:id="3"/>
       </w:r>
       <w:r>
         <w:rPr>
@@ -17731,7 +17646,7 @@
                 <w:rStyle w:val="Rimandonotaapidipagina"/>
                 <w:lang w:val="it-IT"/>
               </w:rPr>
-              <w:footnoteReference w:id="5"/>
+              <w:footnoteReference w:id="4"/>
             </w:r>
           </w:p>
         </w:tc>
@@ -18809,7 +18724,7 @@
                 <w:rStyle w:val="Rimandonotaapidipagina"/>
                 <w:lang w:val="it-IT"/>
               </w:rPr>
-              <w:footnoteReference w:id="6"/>
+              <w:footnoteReference w:id="5"/>
             </w:r>
           </w:p>
         </w:tc>
@@ -24630,10 +24545,7 @@
         </w:rPr>
       </w:pPr>
       <w:r>
-        <w:rPr>
-          <w:b w:val="0"/>
-        </w:rPr>
-        <w:t xml:space="preserve">I dizionari sono la replica locale delle decodifiche pubblicate da ANSC. La pagina li mostra in due elenchi affiancati — i domini a sinistra, i valori del dominio scelto a destra — perché è il modo in cui si consultano: si cerca un dominio e se ne leggono i valori. ⚠️ </w:t>
+        <w:t xml:space="preserve">I dizionari sono la replica locale delle decodifiche pubblicate da ANSC. La pagina li mostra in due elenchi affiancati — i domini a sinistra, i valori del dominio scelto a destra — perché è il modo in cui si consultano: si cerca un dominio e se ne leggono i valori. </w:t>
       </w:r>
       <w:r>
         <w:rPr>
@@ -24642,9 +24554,6 @@
         <w:t>Le colonne mostrate sono esattamente quelle che R901 restituisce</w:t>
       </w:r>
       <w:r>
-        <w:rPr>
-          <w:b w:val="0"/>
-        </w:rPr>
         <w:t>, e nulla di più: la verifica condotta sul contratto ha fatto emergere che il modello ne prevedeva una senza fonte e ne ometteva una disponibile.</w:t>
       </w:r>
     </w:p>
@@ -24659,9 +24568,6 @@
         <w:t>Che cosa R901 restituisce davvero.</w:t>
       </w:r>
       <w:r>
-        <w:rPr>
-          <w:b w:val="0"/>
-        </w:rPr>
         <w:t xml:space="preserve"> L’operazione di elenco («/config/decodifica/elenco») restituisce per ciascuna tabella </w:t>
       </w:r>
       <w:r>
@@ -24671,9 +24577,6 @@
         <w:t>tre soli dati</w:t>
       </w:r>
       <w:r>
-        <w:rPr>
-          <w:b w:val="0"/>
-        </w:rPr>
         <w:t xml:space="preserve">: l’identificativo, il nome della tabella e la </w:t>
       </w:r>
       <w:r>
@@ -24683,9 +24586,6 @@
         <w:t>versione</w:t>
       </w:r>
       <w:r>
-        <w:rPr>
-          <w:b w:val="0"/>
-        </w:rPr>
         <w:t xml:space="preserve">. L’operazione di dettaglio («/config/decodifica/dettaglio») non restituisce una struttura ma </w:t>
       </w:r>
       <w:r>
@@ -24695,45 +24595,7 @@
         <w:t>un CSV codificato in base64 e compresso per impostazione predefinita</w:t>
       </w:r>
       <w:r>
-        <w:rPr>
-          <w:b w:val="0"/>
-        </w:rPr>
         <w:t>, con le colonne ID, DESCRIZIONE, DATAINIZIOVALIDITA, DATAFINEVALIDITA e ORDINAMENTO. Due sole tabelle su centoquarantacinque portano una colonna in più: quella dei casi d’uso e quella dei consolati.</w:t>
-      </w:r>
-    </w:p>
-    <w:p>
-      <w:pPr>
-        <w:jc w:val="both"/>
-      </w:pPr>
-      <w:r>
-        <w:rPr>
-          <w:b w:val="0"/>
-        </w:rPr>
-        <w:t xml:space="preserve">⚠️ </w:t>
-      </w:r>
-      <w:r>
-        <w:rPr>
-          <w:b/>
-        </w:rPr>
-        <w:t>Da qui discendono tre correzioni al modello dati</w:t>
-      </w:r>
-      <w:r>
-        <w:rPr>
-          <w:b w:val="0"/>
-        </w:rPr>
-        <w:t xml:space="preserve">, riportate nella tabella delle strutture e da recepire nell’analisi dell’integrazione: si elimina «cd_valore» da VALORE_DOMINIO, perché il tracciato ha un solo identificativo e non due; si aggiunge la versione a DOMINIO_DECODIFICA, perché è il dato che consente di accorgersi che una tabella è cambiata </w:t>
-      </w:r>
-      <w:r>
-        <w:rPr>
-          <w:b/>
-        </w:rPr>
-        <w:t>senza riscaricarla</w:t>
-      </w:r>
-      <w:r>
-        <w:rPr>
-          <w:b w:val="0"/>
-        </w:rPr>
-        <w:t>; si aggiunge un attributo in formato JSON a VALORE_DOMINIO per accogliere le due colonne aggiuntive, che oggi non avrebbero dove andare.</w:t>
       </w:r>
     </w:p>
     <w:p>
@@ -24933,6 +24795,7 @@
                 <w:sz w:val="17"/>
                 <w:lang w:val="it-IT"/>
               </w:rPr>
+              <w:lastRenderedPageBreak/>
               <w:t>VALORE_DOMINIO</w:t>
             </w:r>
           </w:p>
@@ -25454,7 +25317,6 @@
         <w:rPr>
           <w:lang w:val="it-IT"/>
         </w:rPr>
-        <w:lastRenderedPageBreak/>
         <w:t>Riconciliazione delle decodifiche</w:t>
       </w:r>
       <w:bookmarkEnd w:id="56"/>
@@ -25537,38 +25399,6 @@
         </w:rPr>
         <w:t>Sapere quale dizionario di ANSC governa un campo non dice come tradurre il valore che SIPO ha in tabella. La riconciliazione è quella corrispondenza, valore per valore.</w:t>
       </w:r>
-      <w:r>
-        <w:rPr>
-          <w:lang w:val="it-IT"/>
-        </w:rPr>
-      </w:r>
-      <w:r>
-        <w:rPr>
-          <w:lang w:val="it-IT"/>
-        </w:rPr>
-      </w:r>
-      <w:r>
-        <w:rPr>
-          <w:bCs/>
-          <w:lang w:val="it-IT"/>
-        </w:rPr>
-      </w:r>
-      <w:r>
-        <w:rPr>
-          <w:lang w:val="it-IT"/>
-        </w:rPr>
-      </w:r>
-      <w:r>
-        <w:rPr>
-          <w:bCs/>
-          <w:lang w:val="it-IT"/>
-        </w:rPr>
-      </w:r>
-      <w:r>
-        <w:rPr>
-          <w:lang w:val="it-IT"/>
-        </w:rPr>
-      </w:r>
     </w:p>
     <w:p>
       <w:pPr>
@@ -25578,33 +25408,19 @@
         </w:rPr>
       </w:pPr>
       <w:r>
-        <w:rPr>
-          <w:b w:val="0"/>
-        </w:rPr>
-        <w:t xml:space="preserve">Il raccordo si fa contro le tabelle di configurazione di SIPO — le CONF_* — e la pagina lo espone con le descrizioni di entrambi i lati, perché un confronto fra codici nudi non è verificabile da un funzionario. ⚠️ </w:t>
-      </w:r>
-      <w:r>
-        <w:rPr>
-          <w:b/>
-        </w:rPr>
-        <w:t>L’ordine delle colonne non è indifferente: prima ANSC, poi SIPO.</w:t>
-      </w:r>
-      <w:r>
-        <w:rPr>
-          <w:b w:val="0"/>
-        </w:rPr>
-        <w:t xml:space="preserve"> Il dominio di ANSC dichiara i propri valori e sono un dato certo; ciò che è incerto, e che costituisce il lavoro, è la corrispondenza dal lato di SIPO. Per la stessa ragione </w:t>
-      </w:r>
-      <w:r>
-        <w:rPr>
-          <w:b/>
+        <w:t xml:space="preserve">Il raccordo si fa contro le tabelle di configurazione di SIPO — le CONF_* — e la pagina lo espone con le descrizioni di entrambi i lati, perché un confronto fra codici nudi non è verificabile da un funzionario. Il dominio di ANSC dichiara i propri valori e sono un dato certo; ciò che è incerto, e che costituisce il lavoro, è la corrispondenza dal lato di SIPO. Per la </w:t>
+      </w:r>
+      <w:r>
+        <w:lastRenderedPageBreak/>
+        <w:t xml:space="preserve">stessa ragione </w:t>
+      </w:r>
+      <w:r>
+        <w:rPr>
+          <w:bCs/>
         </w:rPr>
         <w:t>il contrassegno «da mappare» compare sul valore SIPO</w:t>
       </w:r>
       <w:r>
-        <w:rPr>
-          <w:b w:val="0"/>
-        </w:rPr>
         <w:t>, non su quello di ANSC: è lì che manca qualcosa.</w:t>
       </w:r>
     </w:p>
@@ -25614,26 +25430,38 @@
       </w:pPr>
       <w:r>
         <w:rPr>
+          <w:bCs/>
+        </w:rPr>
+        <w:t>La tabella SIPO di riferimento diventa un dato</w:t>
+      </w:r>
+      <w:r>
+        <w:rPr>
           <w:b/>
         </w:rPr>
-        <w:t>La tabella SIPO di riferimento diventa un dato.</w:t>
-      </w:r>
-      <w:r>
-        <w:rPr>
-          <w:b w:val="0"/>
-        </w:rPr>
+        <w:t>.</w:t>
+      </w:r>
+      <w:r>
         <w:t xml:space="preserve"> Nella stesura precedente il filtro «Tabella SIPO» non poggiava su alcuna colonna: era un criterio che la pagina offriva e che il modello non sapeva sostenere. RICONCILIAZ_DIZIONARI acquisisce quindi </w:t>
       </w:r>
       <w:r>
         <w:rPr>
+          <w:bCs/>
+        </w:rPr>
+        <w:t>SCHEMA_SIPO</w:t>
+      </w:r>
+      <w:r>
+        <w:rPr>
           <w:b/>
         </w:rPr>
-        <w:t>SCHEMA_SIPO, TABELLA_SIPO e CAMPO_SIPO</w:t>
-      </w:r>
-      <w:r>
-        <w:rPr>
-          <w:b w:val="0"/>
-        </w:rPr>
+        <w:t xml:space="preserve">, </w:t>
+      </w:r>
+      <w:r>
+        <w:rPr>
+          <w:bCs/>
+        </w:rPr>
+        <w:t>TABELLA_SIPO e CAMPO_SIPO</w:t>
+      </w:r>
+      <w:r>
         <w:t>, con gli stessi nomi già usati da ANSC_CFG_CAMPO. Lo schema serve perché le tabelle di configurazione stanno in schemi diversi e in SIPO esistono tabelle omonime in schemi distinti; il campo serve a sapere quale dato, in concreto, quella corrispondenza traduce.</w:t>
       </w:r>
     </w:p>
@@ -25642,22 +25470,19 @@
         <w:jc w:val="both"/>
       </w:pPr>
       <w:r>
-        <w:rPr>
-          <w:b w:val="0"/>
-        </w:rPr>
-        <w:t xml:space="preserve">⚠️ Il prezzo della scelta va dichiarato: legando la riga anche al campo, </w:t>
-      </w:r>
-      <w:r>
-        <w:rPr>
-          <w:b/>
-        </w:rPr>
-        <w:t>la stessa decodifica usata da due campi diversi richiede due righe</w:t>
-      </w:r>
-      <w:r>
-        <w:rPr>
-          <w:b w:val="0"/>
-        </w:rPr>
-        <w:t>. È stato accettato perché rende la corrispondenza verificabile sul dato reale, e perché è la stessa grana con cui la configurazione dei campi già descrive il lato SIPO.</w:t>
+        <w:t>L</w:t>
+      </w:r>
+      <w:r>
+        <w:t xml:space="preserve">egando la riga anche al campo, </w:t>
+      </w:r>
+      <w:r>
+        <w:rPr>
+          <w:bCs/>
+        </w:rPr>
+        <w:t>la stessa decodifica usata da due campi diversi richiede due righe.</w:t>
+      </w:r>
+      <w:r>
+        <w:t xml:space="preserve"> È stato accettato perché rende la corrispondenza verificabile sul dato reale, e perché è la stessa grana con cui la configurazione dei campi già descrive il lato SIPO.</w:t>
       </w:r>
     </w:p>
     <w:p>
@@ -25672,17 +25497,6 @@
           <w:lang w:val="it-IT"/>
         </w:rPr>
         <w:t>Un valore ammesso da ANSC e privo di corrispondente locale blocca in preverifica ogni atto che lo richieda. Per questo il filtro «Solo non riconciliati» è predefinito a sì: la pagina si apre sul lavoro da fare, non sull’elenco completo.</w:t>
-      </w:r>
-      <w:r>
-        <w:rPr>
-          <w:bCs/>
-          <w:lang w:val="it-IT"/>
-        </w:rPr>
-      </w:r>
-      <w:r>
-        <w:rPr>
-          <w:lang w:val="it-IT"/>
-        </w:rPr>
       </w:r>
     </w:p>
     <w:p>
@@ -26502,6 +26316,7 @@
                 <w:sz w:val="17"/>
                 <w:lang w:val="it-IT"/>
               </w:rPr>
+              <w:lastRenderedPageBreak/>
               <w:t>Valore SIPO</w:t>
             </w:r>
           </w:p>
@@ -26613,7 +26428,6 @@
     <w:p>
       <w:pPr>
         <w:pStyle w:val="Titolo3"/>
-        <w:jc w:val="both"/>
       </w:pPr>
       <w:r>
         <w:t>Il dettaglio di inserimento e modifica</w:t>
@@ -26632,22 +26446,26 @@
         <w:jc w:val="both"/>
       </w:pPr>
       <w:r>
+        <w:rPr>
+          <w:noProof/>
+        </w:rPr>
         <w:drawing>
-          <wp:inline xmlns:a="http://schemas.openxmlformats.org/drawingml/2006/main" xmlns:pic="http://schemas.openxmlformats.org/drawingml/2006/picture">
+          <wp:inline distT="0" distB="0" distL="0" distR="0" wp14:anchorId="0C14BED8" wp14:editId="12EA1BC5">
             <wp:extent cx="5852160" cy="4710045"/>
+            <wp:effectExtent l="0" t="0" r="0" b="0"/>
             <wp:docPr id="1468249223" name="Picture 1468249223"/>
             <wp:cNvGraphicFramePr>
-              <a:graphicFrameLocks noChangeAspect="1"/>
+              <a:graphicFrameLocks xmlns:a="http://schemas.openxmlformats.org/drawingml/2006/main" noChangeAspect="1"/>
             </wp:cNvGraphicFramePr>
-            <a:graphic>
+            <a:graphic xmlns:a="http://schemas.openxmlformats.org/drawingml/2006/main">
               <a:graphicData uri="http://schemas.openxmlformats.org/drawingml/2006/picture">
-                <pic:pic>
+                <pic:pic xmlns:pic="http://schemas.openxmlformats.org/drawingml/2006/picture">
                   <pic:nvPicPr>
                     <pic:cNvPr id="0" name="bo_riconciliazione_dettaglio.png"/>
                     <pic:cNvPicPr/>
                   </pic:nvPicPr>
                   <pic:blipFill>
-                    <a:blip r:embed="rId39"/>
+                    <a:blip r:embed="rId29"/>
                     <a:stretch>
                       <a:fillRect/>
                     </a:stretch>
@@ -26657,7 +26475,9 @@
                       <a:off x="0" y="0"/>
                       <a:ext cx="5852160" cy="4710045"/>
                     </a:xfrm>
-                    <a:prstGeom prst="rect"/>
+                    <a:prstGeom prst="rect">
+                      <a:avLst/>
+                    </a:prstGeom>
                   </pic:spPr>
                 </pic:pic>
               </a:graphicData>
@@ -26684,21 +26504,22 @@
       </w:pPr>
       <w:r>
         <w:rPr>
-          <w:b w:val="0"/>
-        </w:rPr>
-        <w:t xml:space="preserve">⚠️ </w:t>
-      </w:r>
-      <w:r>
-        <w:rPr>
-          <w:b/>
-        </w:rPr>
-        <w:t>La disposizione dei due pannelli è la traduzione grafica della scelta di modello.</w:t>
-      </w:r>
-      <w:r>
-        <w:rPr>
-          <w:b w:val="0"/>
-        </w:rPr>
-        <w:t xml:space="preserve"> Sopra sta il lato ANSC, in sola lettura, perché è ciò che il dominio dichiara e non si discute; sotto il lato SIPO, da completare, perché è il lavoro. Una maschera che li mettesse alla pari, o che chiedesse prima il valore locale, suggerirebbe che i due lati abbiano lo stesso grado di certezza — e sono esattamente le due cose che la struttura distingue, con l’obbligatorietà su uno solo dei due.</w:t>
+          <w:bCs/>
+        </w:rPr>
+        <w:t xml:space="preserve">La disposizione dei due pannelli è la traduzione grafica della scelta di modello. </w:t>
+      </w:r>
+      <w:r>
+        <w:t xml:space="preserve">Sopra </w:t>
+      </w:r>
+      <w:r>
+        <w:t>risiede</w:t>
+      </w:r>
+      <w:r>
+        <w:t xml:space="preserve"> il lato ANSC, in sola lettura, perché è ciò che il dominio dichiara e non si discute; sotto il lato SIPO, da completare, perché è il lavoro. Una maschera che li mettesse alla pari, o che </w:t>
+      </w:r>
+      <w:r>
+        <w:lastRenderedPageBreak/>
+        <w:t>chiedesse prima il valore locale, suggerirebbe che i due lati abbiano lo stesso grado di certezza — e sono esattamente le due cose che la struttura distingue, con l’obbligatorietà su uno solo dei due.</w:t>
       </w:r>
     </w:p>
     <w:p>
@@ -26707,15 +26528,18 @@
       </w:pPr>
       <w:r>
         <w:rPr>
-          <w:b/>
-        </w:rPr>
-        <w:t>Salvare senza valore SIPO è consentito, ed è un atto significativo.</w:t>
-      </w:r>
-      <w:r>
-        <w:rPr>
-          <w:b w:val="0"/>
-        </w:rPr>
-        <w:t xml:space="preserve"> La riga che ne risulta non è una bozza lasciata a metà: dichiara che quel valore ammesso da ANSC non ha, oggi, un corrispondente nelle tabelle del Comune. È la stessa riga che l’elenco mostra come «da mappare» e che il filtro predefinito porta in cima. ⚠️ Nella struttura precedente questo non era rappresentabile, perché il valore obbligatorio era quello di SIPO.</w:t>
+          <w:bCs/>
+        </w:rPr>
+        <w:t>Salvare senza valore SIPO è consentito, ed è un</w:t>
+      </w:r>
+      <w:r>
+        <w:rPr>
+          <w:bCs/>
+        </w:rPr>
+        <w:t>a scelta che</w:t>
+      </w:r>
+      <w:r>
+        <w:t xml:space="preserve"> dichiara che quel valore ammesso da ANSC non ha, oggi, un corrispondente nelle tabelle del Comune. È la stessa riga che l’elenco mostra come «da mappare» e che il filtro predefinito porta in cima. </w:t>
       </w:r>
     </w:p>
     <w:p>
@@ -26726,19 +26550,15 @@
         <w:rPr>
           <w:b/>
         </w:rPr>
-        <w:t>Una corrispondenza che cambia non si sovrascrive: si chiude e se ne apre una nuova.</w:t>
-      </w:r>
-      <w:r>
-        <w:rPr>
-          <w:b w:val="0"/>
-        </w:rPr>
-        <w:t xml:space="preserve"> Il motivo non è prudenza archivistica ma una necessità: gli atti già depositati sono stati costruiti con la corrispondenza in vigore allora, e devono restare leggibili così. Per questo la maschera, quando trova una corrispondenza già valida per la stessa chiave, lo dichiara prima di salvare e dice che cosa accadrà, invece di rifiutare o di sostituire in silenzio.</w:t>
+        <w:t>G</w:t>
+      </w:r>
+      <w:r>
+        <w:t>li atti già depositati sono stati costruiti con la corrispondenza in vigore allora, e devono restare leggibili così. Per questo la maschera, quando trova una corrispondenza già valida per la stessa chiave, lo dichiara prima di salvare e dice che cosa accadrà, invece di rifiutare o di sostituire in silenzio.</w:t>
       </w:r>
     </w:p>
     <w:p>
       <w:pPr>
         <w:pStyle w:val="Titolo3"/>
-        <w:jc w:val="both"/>
       </w:pPr>
       <w:r>
         <w:t>Campi e azioni del dettaglio</w:t>
@@ -26751,14 +26571,15 @@
         <w:tblLook w:val="04A0" w:firstRow="1" w:lastRow="0" w:firstColumn="1" w:lastColumn="0" w:noHBand="0" w:noVBand="1"/>
       </w:tblPr>
       <w:tblGrid>
-        <w:gridCol w:w="3120"/>
-        <w:gridCol w:w="3120"/>
-        <w:gridCol w:w="3120"/>
+        <w:gridCol w:w="2302"/>
+        <w:gridCol w:w="1095"/>
+        <w:gridCol w:w="5953"/>
       </w:tblGrid>
       <w:tr>
         <w:tc>
           <w:tcPr>
-            <w:tcW w:type="dxa" w:w="2304"/>
+            <w:tcW w:w="2302" w:type="dxa"/>
+            <w:shd w:val="clear" w:color="auto" w:fill="DAE9F7" w:themeFill="text2" w:themeFillTint="1A"/>
           </w:tcPr>
           <w:p>
             <w:pPr>
@@ -26775,7 +26596,8 @@
         </w:tc>
         <w:tc>
           <w:tcPr>
-            <w:tcW w:type="dxa" w:w="1584"/>
+            <w:tcW w:w="1095" w:type="dxa"/>
+            <w:shd w:val="clear" w:color="auto" w:fill="DAE9F7" w:themeFill="text2" w:themeFillTint="1A"/>
           </w:tcPr>
           <w:p>
             <w:pPr>
@@ -26792,7 +26614,8 @@
         </w:tc>
         <w:tc>
           <w:tcPr>
-            <w:tcW w:type="dxa" w:w="5472"/>
+            <w:tcW w:w="5953" w:type="dxa"/>
+            <w:shd w:val="clear" w:color="auto" w:fill="DAE9F7" w:themeFill="text2" w:themeFillTint="1A"/>
           </w:tcPr>
           <w:p>
             <w:pPr>
@@ -26811,7 +26634,7 @@
       <w:tr>
         <w:tc>
           <w:tcPr>
-            <w:tcW w:type="dxa" w:w="2304"/>
+            <w:tcW w:w="2302" w:type="dxa"/>
           </w:tcPr>
           <w:p>
             <w:pPr>
@@ -26827,7 +26650,7 @@
         </w:tc>
         <w:tc>
           <w:tcPr>
-            <w:tcW w:type="dxa" w:w="1584"/>
+            <w:tcW w:w="1095" w:type="dxa"/>
           </w:tcPr>
           <w:p>
             <w:pPr>
@@ -26843,7 +26666,7 @@
         </w:tc>
         <w:tc>
           <w:tcPr>
-            <w:tcW w:type="dxa" w:w="5472"/>
+            <w:tcW w:w="5953" w:type="dxa"/>
           </w:tcPr>
           <w:p>
             <w:pPr>
@@ -26861,7 +26684,7 @@
       <w:tr>
         <w:tc>
           <w:tcPr>
-            <w:tcW w:type="dxa" w:w="2304"/>
+            <w:tcW w:w="2302" w:type="dxa"/>
           </w:tcPr>
           <w:p>
             <w:pPr>
@@ -26877,7 +26700,7 @@
         </w:tc>
         <w:tc>
           <w:tcPr>
-            <w:tcW w:type="dxa" w:w="1584"/>
+            <w:tcW w:w="1095" w:type="dxa"/>
           </w:tcPr>
           <w:p>
             <w:pPr>
@@ -26893,23 +26716,20 @@
         </w:tc>
         <w:tc>
           <w:tcPr>
-            <w:tcW w:type="dxa" w:w="5472"/>
-          </w:tcPr>
-          <w:p>
-            <w:pPr>
-              <w:jc w:val="both"/>
-            </w:pPr>
-            <w:r>
-              <w:rPr>
-                <w:b/>
-              </w:rPr>
-              <w:t>Obbligatorio.</w:t>
-            </w:r>
-            <w:r>
-              <w:rPr>
-                <w:b w:val="0"/>
-              </w:rPr>
-              <w:t xml:space="preserve"> Tendina dei valori che il dominio dichiara validi alla data indicata. ⚠️ Non è testo libero: un valore che ANSC non ammette non è riconciliabile, e lasciarlo scrivere a mano produrrebbe corrispondenze verso valori inesistenti.</w:t>
+            <w:tcW w:w="5953" w:type="dxa"/>
+          </w:tcPr>
+          <w:p>
+            <w:pPr>
+              <w:jc w:val="both"/>
+              <w:rPr>
+                <w:sz w:val="18"/>
+              </w:rPr>
+            </w:pPr>
+            <w:r>
+              <w:rPr>
+                <w:sz w:val="18"/>
+              </w:rPr>
+              <w:t>Obbligatorio. Tendina dei valori che il dominio dichiara validi alla data indicata.</w:t>
             </w:r>
           </w:p>
         </w:tc>
@@ -26917,7 +26737,7 @@
       <w:tr>
         <w:tc>
           <w:tcPr>
-            <w:tcW w:type="dxa" w:w="2304"/>
+            <w:tcW w:w="2302" w:type="dxa"/>
           </w:tcPr>
           <w:p>
             <w:pPr>
@@ -26933,7 +26753,7 @@
         </w:tc>
         <w:tc>
           <w:tcPr>
-            <w:tcW w:type="dxa" w:w="1584"/>
+            <w:tcW w:w="1095" w:type="dxa"/>
           </w:tcPr>
           <w:p>
             <w:pPr>
@@ -26949,11 +26769,14 @@
         </w:tc>
         <w:tc>
           <w:tcPr>
-            <w:tcW w:type="dxa" w:w="5472"/>
-          </w:tcPr>
-          <w:p>
-            <w:pPr>
-              <w:jc w:val="both"/>
+            <w:tcW w:w="5953" w:type="dxa"/>
+          </w:tcPr>
+          <w:p>
+            <w:pPr>
+              <w:jc w:val="both"/>
+              <w:rPr>
+                <w:sz w:val="18"/>
+              </w:rPr>
             </w:pPr>
             <w:r>
               <w:rPr>
@@ -26967,7 +26790,7 @@
       <w:tr>
         <w:tc>
           <w:tcPr>
-            <w:tcW w:type="dxa" w:w="2304"/>
+            <w:tcW w:w="2302" w:type="dxa"/>
           </w:tcPr>
           <w:p>
             <w:pPr>
@@ -26983,7 +26806,7 @@
         </w:tc>
         <w:tc>
           <w:tcPr>
-            <w:tcW w:type="dxa" w:w="1584"/>
+            <w:tcW w:w="1095" w:type="dxa"/>
           </w:tcPr>
           <w:p>
             <w:pPr>
@@ -26999,17 +26822,20 @@
         </w:tc>
         <w:tc>
           <w:tcPr>
-            <w:tcW w:type="dxa" w:w="5472"/>
-          </w:tcPr>
-          <w:p>
-            <w:pPr>
-              <w:jc w:val="both"/>
-            </w:pPr>
-            <w:r>
+            <w:tcW w:w="5953" w:type="dxa"/>
+          </w:tcPr>
+          <w:p>
+            <w:pPr>
+              <w:jc w:val="both"/>
               <w:rPr>
                 <w:sz w:val="18"/>
               </w:rPr>
-              <w:t>Sola lettura, informativa. ⚠️ Serve a rendere visibile il caso in cui si stia riconciliando un valore che ANSC ha già chiuso: è legittimo per gli atti vecchi, è un errore per quelli nuovi.</w:t>
+            </w:pPr>
+            <w:r>
+              <w:rPr>
+                <w:sz w:val="18"/>
+              </w:rPr>
+              <w:t>Sola lettura, informativa. Serve a rendere visibile il caso in cui si stia riconciliando un valore che ANSC ha già chiuso: è legittimo per gli atti vecchi, è un errore per quelli nuovi.</w:t>
             </w:r>
           </w:p>
         </w:tc>
@@ -27017,7 +26843,7 @@
       <w:tr>
         <w:tc>
           <w:tcPr>
-            <w:tcW w:type="dxa" w:w="2304"/>
+            <w:tcW w:w="2302" w:type="dxa"/>
           </w:tcPr>
           <w:p>
             <w:pPr>
@@ -27033,7 +26859,7 @@
         </w:tc>
         <w:tc>
           <w:tcPr>
-            <w:tcW w:type="dxa" w:w="1584"/>
+            <w:tcW w:w="1095" w:type="dxa"/>
           </w:tcPr>
           <w:p>
             <w:pPr>
@@ -27049,11 +26875,14 @@
         </w:tc>
         <w:tc>
           <w:tcPr>
-            <w:tcW w:type="dxa" w:w="5472"/>
-          </w:tcPr>
-          <w:p>
-            <w:pPr>
-              <w:jc w:val="both"/>
+            <w:tcW w:w="5953" w:type="dxa"/>
+          </w:tcPr>
+          <w:p>
+            <w:pPr>
+              <w:jc w:val="both"/>
+              <w:rPr>
+                <w:sz w:val="18"/>
+              </w:rPr>
             </w:pPr>
             <w:r>
               <w:rPr>
@@ -27067,7 +26896,7 @@
       <w:tr>
         <w:tc>
           <w:tcPr>
-            <w:tcW w:type="dxa" w:w="2304"/>
+            <w:tcW w:w="2302" w:type="dxa"/>
           </w:tcPr>
           <w:p>
             <w:pPr>
@@ -27083,7 +26912,7 @@
         </w:tc>
         <w:tc>
           <w:tcPr>
-            <w:tcW w:type="dxa" w:w="1584"/>
+            <w:tcW w:w="1095" w:type="dxa"/>
           </w:tcPr>
           <w:p>
             <w:pPr>
@@ -27099,29 +26928,33 @@
         </w:tc>
         <w:tc>
           <w:tcPr>
-            <w:tcW w:type="dxa" w:w="5472"/>
-          </w:tcPr>
-          <w:p>
-            <w:pPr>
-              <w:jc w:val="both"/>
-            </w:pPr>
-            <w:r>
-              <w:rPr>
-                <w:b w:val="0"/>
-              </w:rPr>
-              <w:t xml:space="preserve">Alimenta CAMPO_SIPO. ⚠️ </w:t>
-            </w:r>
-            <w:r>
-              <w:rPr>
-                <w:b/>
-              </w:rPr>
-              <w:t>Entra nella chiave di unicità</w:t>
-            </w:r>
-            <w:r>
-              <w:rPr>
-                <w:b w:val="0"/>
-              </w:rPr>
-              <w:t>: cambiarlo non modifica questa corrispondenza, ne dichiara un’altra. La maschera lo segnala prima di salvare.</w:t>
+            <w:tcW w:w="5953" w:type="dxa"/>
+          </w:tcPr>
+          <w:p>
+            <w:pPr>
+              <w:jc w:val="both"/>
+              <w:rPr>
+                <w:sz w:val="18"/>
+              </w:rPr>
+            </w:pPr>
+            <w:r>
+              <w:rPr>
+                <w:sz w:val="18"/>
+              </w:rPr>
+              <w:t xml:space="preserve">Alimenta CAMPO_SIPO. </w:t>
+            </w:r>
+            <w:r>
+              <w:rPr>
+                <w:rFonts w:ascii="Cambria" w:hAnsi="Cambria" w:cs="Apple Color Emoji"/>
+                <w:sz w:val="18"/>
+              </w:rPr>
+              <w:t>E</w:t>
+            </w:r>
+            <w:r>
+              <w:rPr>
+                <w:sz w:val="18"/>
+              </w:rPr>
+              <w:t>ntra nella chiave di unicità: cambiarlo non modifica questa corrispondenza, ne dichiara un’altra. La maschera lo segnala prima di salvare.</w:t>
             </w:r>
           </w:p>
         </w:tc>
@@ -27129,67 +26962,70 @@
       <w:tr>
         <w:tc>
           <w:tcPr>
-            <w:tcW w:type="dxa" w:w="2304"/>
-          </w:tcPr>
-          <w:p>
-            <w:pPr>
-              <w:jc w:val="both"/>
-            </w:pPr>
-            <w:r>
+            <w:tcW w:w="2302" w:type="dxa"/>
+          </w:tcPr>
+          <w:p>
+            <w:pPr>
+              <w:jc w:val="both"/>
               <w:rPr>
                 <w:sz w:val="18"/>
               </w:rPr>
+            </w:pPr>
+            <w:r>
+              <w:rPr>
+                <w:sz w:val="18"/>
+              </w:rPr>
               <w:t>Valore SIPO</w:t>
             </w:r>
           </w:p>
         </w:tc>
         <w:tc>
           <w:tcPr>
-            <w:tcW w:type="dxa" w:w="1584"/>
-          </w:tcPr>
-          <w:p>
-            <w:pPr>
-              <w:jc w:val="both"/>
-            </w:pPr>
-            <w:r>
+            <w:tcW w:w="1095" w:type="dxa"/>
+          </w:tcPr>
+          <w:p>
+            <w:pPr>
+              <w:jc w:val="both"/>
               <w:rPr>
                 <w:sz w:val="18"/>
               </w:rPr>
+            </w:pPr>
+            <w:r>
+              <w:rPr>
+                <w:sz w:val="18"/>
+              </w:rPr>
               <w:t>Campo</w:t>
             </w:r>
           </w:p>
         </w:tc>
         <w:tc>
           <w:tcPr>
-            <w:tcW w:type="dxa" w:w="5472"/>
-          </w:tcPr>
-          <w:p>
-            <w:pPr>
-              <w:jc w:val="both"/>
-            </w:pPr>
-            <w:r>
-              <w:rPr>
-                <w:b/>
-              </w:rPr>
-              <w:t>Facoltativo</w:t>
-            </w:r>
-            <w:r>
-              <w:rPr>
-                <w:b w:val="0"/>
-              </w:rPr>
-              <w:t xml:space="preserve">, ed è il punto dell’intera maschera. Tendina alimentata dalla tabella scelta. ⚠️ Salvare lasciandolo vuoto non è una bozza incompleta: è la </w:t>
-            </w:r>
-            <w:r>
-              <w:rPr>
-                <w:b/>
-              </w:rPr>
-              <w:t>dichiarazione</w:t>
-            </w:r>
-            <w:r>
-              <w:rPr>
-                <w:b w:val="0"/>
-              </w:rPr>
-              <w:t xml:space="preserve"> che quel valore ammesso da ANSC non ha ancora un corrispondente locale, ed è la riga che l’elenco mostra come «da mappare».</w:t>
+            <w:tcW w:w="5953" w:type="dxa"/>
+          </w:tcPr>
+          <w:p>
+            <w:pPr>
+              <w:jc w:val="both"/>
+              <w:rPr>
+                <w:sz w:val="18"/>
+              </w:rPr>
+            </w:pPr>
+            <w:r>
+              <w:rPr>
+                <w:sz w:val="18"/>
+              </w:rPr>
+              <w:t>Facoltativo, ed è il punto</w:t>
+            </w:r>
+            <w:r>
+              <w:rPr>
+                <w:sz w:val="18"/>
+              </w:rPr>
+              <w:t xml:space="preserve"> importante</w:t>
+            </w:r>
+            <w:r>
+              <w:rPr>
+                <w:sz w:val="18"/>
+              </w:rPr>
+              <w:t xml:space="preserve"> dell’intera maschera. Tendina alimentata dalla tabella scelta. Salvare lasciandolo vuoto non è una bozza incompleta: è la dichiarazione che quel valore ammesso da ANSC non ha ancora un corrispondente locale, ed è la riga che l’elenco mostra come «da mappare».</w:t>
             </w:r>
           </w:p>
         </w:tc>
@@ -27197,7 +27033,7 @@
       <w:tr>
         <w:tc>
           <w:tcPr>
-            <w:tcW w:type="dxa" w:w="2304"/>
+            <w:tcW w:w="2302" w:type="dxa"/>
           </w:tcPr>
           <w:p>
             <w:pPr>
@@ -27213,7 +27049,7 @@
         </w:tc>
         <w:tc>
           <w:tcPr>
-            <w:tcW w:type="dxa" w:w="1584"/>
+            <w:tcW w:w="1095" w:type="dxa"/>
           </w:tcPr>
           <w:p>
             <w:pPr>
@@ -27229,7 +27065,7 @@
         </w:tc>
         <w:tc>
           <w:tcPr>
-            <w:tcW w:type="dxa" w:w="5472"/>
+            <w:tcW w:w="5953" w:type="dxa"/>
           </w:tcPr>
           <w:p>
             <w:pPr>
@@ -27247,7 +27083,7 @@
       <w:tr>
         <w:tc>
           <w:tcPr>
-            <w:tcW w:type="dxa" w:w="2304"/>
+            <w:tcW w:w="2302" w:type="dxa"/>
           </w:tcPr>
           <w:p>
             <w:pPr>
@@ -27263,7 +27099,7 @@
         </w:tc>
         <w:tc>
           <w:tcPr>
-            <w:tcW w:type="dxa" w:w="1584"/>
+            <w:tcW w:w="1095" w:type="dxa"/>
           </w:tcPr>
           <w:p>
             <w:pPr>
@@ -27279,7 +27115,7 @@
         </w:tc>
         <w:tc>
           <w:tcPr>
-            <w:tcW w:type="dxa" w:w="5472"/>
+            <w:tcW w:w="5953" w:type="dxa"/>
           </w:tcPr>
           <w:p>
             <w:pPr>
@@ -27297,7 +27133,7 @@
       <w:tr>
         <w:tc>
           <w:tcPr>
-            <w:tcW w:type="dxa" w:w="2304"/>
+            <w:tcW w:w="2302" w:type="dxa"/>
           </w:tcPr>
           <w:p>
             <w:pPr>
@@ -27313,7 +27149,7 @@
         </w:tc>
         <w:tc>
           <w:tcPr>
-            <w:tcW w:type="dxa" w:w="1584"/>
+            <w:tcW w:w="1095" w:type="dxa"/>
           </w:tcPr>
           <w:p>
             <w:pPr>
@@ -27329,7 +27165,7 @@
         </w:tc>
         <w:tc>
           <w:tcPr>
-            <w:tcW w:type="dxa" w:w="5472"/>
+            <w:tcW w:w="5953" w:type="dxa"/>
           </w:tcPr>
           <w:p>
             <w:pPr>
@@ -27347,61 +27183,58 @@
       <w:tr>
         <w:tc>
           <w:tcPr>
-            <w:tcW w:type="dxa" w:w="2304"/>
-          </w:tcPr>
-          <w:p>
-            <w:pPr>
-              <w:jc w:val="both"/>
-            </w:pPr>
-            <w:r>
+            <w:tcW w:w="2302" w:type="dxa"/>
+          </w:tcPr>
+          <w:p>
+            <w:pPr>
+              <w:jc w:val="both"/>
               <w:rPr>
                 <w:sz w:val="18"/>
               </w:rPr>
+            </w:pPr>
+            <w:r>
+              <w:rPr>
+                <w:sz w:val="18"/>
+              </w:rPr>
               <w:t>Valida dal * / Valida fino al</w:t>
             </w:r>
           </w:p>
         </w:tc>
         <w:tc>
           <w:tcPr>
-            <w:tcW w:type="dxa" w:w="1584"/>
-          </w:tcPr>
-          <w:p>
-            <w:pPr>
-              <w:jc w:val="both"/>
-            </w:pPr>
-            <w:r>
+            <w:tcW w:w="1095" w:type="dxa"/>
+          </w:tcPr>
+          <w:p>
+            <w:pPr>
+              <w:jc w:val="both"/>
               <w:rPr>
                 <w:sz w:val="18"/>
               </w:rPr>
+            </w:pPr>
+            <w:r>
+              <w:rPr>
+                <w:sz w:val="18"/>
+              </w:rPr>
               <w:t>Campi</w:t>
             </w:r>
           </w:p>
         </w:tc>
         <w:tc>
           <w:tcPr>
-            <w:tcW w:type="dxa" w:w="5472"/>
-          </w:tcPr>
-          <w:p>
-            <w:pPr>
-              <w:jc w:val="both"/>
-            </w:pPr>
-            <w:r>
-              <w:rPr>
-                <w:b w:val="0"/>
-              </w:rPr>
-              <w:t xml:space="preserve">⚠️ È la validità </w:t>
-            </w:r>
-            <w:r>
-              <w:rPr>
-                <w:b/>
-              </w:rPr>
-              <w:t>della corrispondenza</w:t>
-            </w:r>
-            <w:r>
-              <w:rPr>
-                <w:b w:val="0"/>
-              </w:rPr>
-              <w:t>, da non confondere con quella del valore in ANSC mostrata sopra. La prima è una decisione del Comune, la seconda un dato di ANSC.</w:t>
+            <w:tcW w:w="5953" w:type="dxa"/>
+          </w:tcPr>
+          <w:p>
+            <w:pPr>
+              <w:jc w:val="both"/>
+              <w:rPr>
+                <w:sz w:val="18"/>
+              </w:rPr>
+            </w:pPr>
+            <w:r>
+              <w:rPr>
+                <w:sz w:val="18"/>
+              </w:rPr>
+              <w:t>È la validità della corrispondenza, da non confondere con quella del valore in ANSC mostrata sopra. La prima è una decisione del Comune, la seconda un dato di ANSC.</w:t>
             </w:r>
           </w:p>
         </w:tc>
@@ -27409,61 +27242,58 @@
       <w:tr>
         <w:tc>
           <w:tcPr>
-            <w:tcW w:type="dxa" w:w="2304"/>
-          </w:tcPr>
-          <w:p>
-            <w:pPr>
-              <w:jc w:val="both"/>
-            </w:pPr>
-            <w:r>
+            <w:tcW w:w="2302" w:type="dxa"/>
+          </w:tcPr>
+          <w:p>
+            <w:pPr>
+              <w:jc w:val="both"/>
               <w:rPr>
                 <w:sz w:val="18"/>
               </w:rPr>
+            </w:pPr>
+            <w:r>
+              <w:rPr>
+                <w:sz w:val="18"/>
+              </w:rPr>
               <w:t>SALVA</w:t>
             </w:r>
           </w:p>
         </w:tc>
         <w:tc>
           <w:tcPr>
-            <w:tcW w:type="dxa" w:w="1584"/>
-          </w:tcPr>
-          <w:p>
-            <w:pPr>
-              <w:jc w:val="both"/>
-            </w:pPr>
-            <w:r>
+            <w:tcW w:w="1095" w:type="dxa"/>
+          </w:tcPr>
+          <w:p>
+            <w:pPr>
+              <w:jc w:val="both"/>
               <w:rPr>
                 <w:sz w:val="18"/>
               </w:rPr>
+            </w:pPr>
+            <w:r>
+              <w:rPr>
+                <w:sz w:val="18"/>
+              </w:rPr>
               <w:t>Azione</w:t>
             </w:r>
           </w:p>
         </w:tc>
         <w:tc>
           <w:tcPr>
-            <w:tcW w:type="dxa" w:w="5472"/>
-          </w:tcPr>
-          <w:p>
-            <w:pPr>
-              <w:jc w:val="both"/>
-            </w:pPr>
-            <w:r>
-              <w:rPr>
-                <w:b w:val="0"/>
-              </w:rPr>
-              <w:t xml:space="preserve">Verifica la chiave di unicità — versione, decodifica, valore ANSC, campo, data di inizio — e, se una corrispondenza è già in vigore, </w:t>
-            </w:r>
-            <w:r>
-              <w:rPr>
-                <w:b/>
-              </w:rPr>
-              <w:t>la chiude alla data indicata invece di sovrascriverla</w:t>
-            </w:r>
-            <w:r>
-              <w:rPr>
-                <w:b w:val="0"/>
-              </w:rPr>
-              <w:t>, aprendo la nuova da lì in avanti.</w:t>
+            <w:tcW w:w="5953" w:type="dxa"/>
+          </w:tcPr>
+          <w:p>
+            <w:pPr>
+              <w:jc w:val="both"/>
+              <w:rPr>
+                <w:sz w:val="18"/>
+              </w:rPr>
+            </w:pPr>
+            <w:r>
+              <w:rPr>
+                <w:sz w:val="18"/>
+              </w:rPr>
+              <w:t>Verifica la chiave di unicità — versione, decodifica, valore ANSC, campo, data di inizio — e, se una corrispondenza è già in vigore, la chiude alla data indicata invece di sovrascriverla, aprendo la nuova da lì in avanti.</w:t>
             </w:r>
           </w:p>
         </w:tc>
@@ -27471,7 +27301,7 @@
       <w:tr>
         <w:tc>
           <w:tcPr>
-            <w:tcW w:type="dxa" w:w="2304"/>
+            <w:tcW w:w="2302" w:type="dxa"/>
           </w:tcPr>
           <w:p>
             <w:pPr>
@@ -27487,7 +27317,7 @@
         </w:tc>
         <w:tc>
           <w:tcPr>
-            <w:tcW w:type="dxa" w:w="1584"/>
+            <w:tcW w:w="1095" w:type="dxa"/>
           </w:tcPr>
           <w:p>
             <w:pPr>
@@ -27503,7 +27333,7 @@
         </w:tc>
         <w:tc>
           <w:tcPr>
-            <w:tcW w:type="dxa" w:w="5472"/>
+            <w:tcW w:w="5953" w:type="dxa"/>
           </w:tcPr>
           <w:p>
             <w:pPr>
@@ -27513,7 +27343,7 @@
               <w:rPr>
                 <w:sz w:val="18"/>
               </w:rPr>
-              <w:t>Salva e apre subito la corrispondenza non riconciliata successiva, secondo l’ordine dell’elenco da cui si è partiti. ⚠️ È l’azione che rende praticabile un lavoro fatto di molte righe brevi: senza, si torna all’elenco a ogni salvataggio.</w:t>
+              <w:t>Salva e apre subito la corrispondenza non riconciliata successiva, secondo l’ordine dell’elenco da cui si è partiti. È l’azione che rende praticabile un lavoro fatto di molte righe brevi: senza, si torna all’elenco a ogni salvataggio.</w:t>
             </w:r>
           </w:p>
         </w:tc>
@@ -27521,7 +27351,7 @@
       <w:tr>
         <w:tc>
           <w:tcPr>
-            <w:tcW w:type="dxa" w:w="2304"/>
+            <w:tcW w:w="2302" w:type="dxa"/>
           </w:tcPr>
           <w:p>
             <w:pPr>
@@ -27531,13 +27361,14 @@
               <w:rPr>
                 <w:sz w:val="18"/>
               </w:rPr>
+              <w:lastRenderedPageBreak/>
               <w:t>ANNULLA</w:t>
             </w:r>
           </w:p>
         </w:tc>
         <w:tc>
           <w:tcPr>
-            <w:tcW w:type="dxa" w:w="1584"/>
+            <w:tcW w:w="1095" w:type="dxa"/>
           </w:tcPr>
           <w:p>
             <w:pPr>
@@ -27553,7 +27384,7 @@
         </w:tc>
         <w:tc>
           <w:tcPr>
-            <w:tcW w:type="dxa" w:w="5472"/>
+            <w:tcW w:w="5953" w:type="dxa"/>
           </w:tcPr>
           <w:p>
             <w:pPr>
@@ -27599,8 +27430,8 @@
           <w:lang w:val="it-IT"/>
         </w:rPr>
         <w:drawing>
-          <wp:inline distT="0" distB="0" distL="0" distR="0" wp14:anchorId="30804F92" wp14:editId="45796A5B">
-            <wp:extent cx="5852160" cy="2605155"/>
+          <wp:inline distT="0" distB="0" distL="0" distR="0" wp14:anchorId="30804F92" wp14:editId="069926E4">
+            <wp:extent cx="4169923" cy="2604770"/>
             <wp:effectExtent l="0" t="0" r="0" b="0"/>
             <wp:docPr id="1468249219" name="Picture 1468249219"/>
             <wp:cNvGraphicFramePr>
@@ -27614,7 +27445,7 @@
                     <pic:cNvPicPr/>
                   </pic:nvPicPr>
                   <pic:blipFill>
-                    <a:blip r:embed="rId29"/>
+                    <a:blip r:embed="rId30"/>
                     <a:stretch>
                       <a:fillRect/>
                     </a:stretch>
@@ -27622,7 +27453,7 @@
                   <pic:spPr>
                     <a:xfrm>
                       <a:off x="0" y="0"/>
-                      <a:ext cx="5852160" cy="2605155"/>
+                      <a:ext cx="4174229" cy="2607459"/>
                     </a:xfrm>
                     <a:prstGeom prst="rect">
                       <a:avLst/>
@@ -27662,7 +27493,7 @@
         <w:rPr>
           <w:lang w:val="it-IT"/>
         </w:rPr>
-        <w:t>La configurazione non è un carico iniziale: è un flusso. Il mapping di ANSC è rivisto in media ogni diciassette giorni, e senza un governo delle versioni ogni revisione arriverebbe in esercizio senza che nessuno l’abbia guardata.</w:t>
+        <w:t>La configurazione non è un flusso. Il mapping di ANSC è rivisto in media ogni diciassette giorni, e senza un governo delle versioni ogni revisione arriverebbe in esercizio senza che nessuno l’abbia guardata.</w:t>
       </w:r>
     </w:p>
     <w:p>
@@ -27725,7 +27556,6 @@
       </w:pPr>
       <w:bookmarkStart w:id="60" w:name="_Toc241591942"/>
       <w:r>
-        <w:lastRenderedPageBreak/>
         <w:t>Tabelle sottese</w:t>
       </w:r>
       <w:bookmarkEnd w:id="60"/>
@@ -28013,6 +27843,7 @@
                 <w:sz w:val="17"/>
                 <w:lang w:val="it-IT"/>
               </w:rPr>
+              <w:lastRenderedPageBreak/>
               <w:t>ANSC_STATO_ATTO</w:t>
             </w:r>
           </w:p>
@@ -28603,7 +28434,7 @@
                     <pic:cNvPicPr/>
                   </pic:nvPicPr>
                   <pic:blipFill>
-                    <a:blip r:embed="rId30"/>
+                    <a:blip r:embed="rId31"/>
                     <a:stretch>
                       <a:fillRect/>
                     </a:stretch>
@@ -28678,6 +28509,7 @@
         <w:rPr>
           <w:lang w:val="it-IT"/>
         </w:rPr>
+        <w:lastRenderedPageBreak/>
         <w:t>La doppia via non è una ridondanza: la riga di comando serve alle esecuzioni pianificate e all’assistenza, l’interfaccia serve al funzionario che deve poter avviare un’importazione senza chiedere a nessuno. Entrambe scrivono nello stesso registro, ed è il registro a rendere la pagina utile.</w:t>
       </w:r>
     </w:p>
@@ -29542,7 +29374,7 @@
                     <pic:cNvPicPr/>
                   </pic:nvPicPr>
                   <pic:blipFill>
-                    <a:blip r:embed="rId31"/>
+                    <a:blip r:embed="rId32"/>
                     <a:stretch>
                       <a:fillRect/>
                     </a:stretch>
@@ -30385,7 +30217,7 @@
                     <pic:cNvPicPr/>
                   </pic:nvPicPr>
                   <pic:blipFill>
-                    <a:blip r:embed="rId32"/>
+                    <a:blip r:embed="rId33"/>
                     <a:stretch>
                       <a:fillRect/>
                     </a:stretch>
@@ -32885,6 +32717,7 @@
         <w:rPr>
           <w:lang w:val="it-IT"/>
         </w:rPr>
+        <w:lastRenderedPageBreak/>
         <w:br w:type="page"/>
       </w:r>
     </w:p>
@@ -34113,8 +33946,8 @@
         <w:tblLook w:val="04A0" w:firstRow="1" w:lastRow="0" w:firstColumn="1" w:lastColumn="0" w:noHBand="0" w:noVBand="1"/>
       </w:tblPr>
       <w:tblGrid>
-        <w:gridCol w:w="719"/>
-        <w:gridCol w:w="2734"/>
+        <w:gridCol w:w="720"/>
+        <w:gridCol w:w="2733"/>
         <w:gridCol w:w="5897"/>
       </w:tblGrid>
       <w:tr>
@@ -35133,7 +34966,15 @@
                 <w:sz w:val="17"/>
                 <w:lang w:val="it-IT"/>
               </w:rPr>
-              <w:t>Il distintivo della sessione sta oggi accanto al titolo della pagina. La shell sta predisponendo un’area dedicata sotto la testata: quando sarà pronta il distintivo vi si trasferirà, e con esso ogni altra informazione di contesto che oggi il micro-frontend disegna per conto proprio.</w:t>
+              <w:t xml:space="preserve">Il distintivo della sessione sta oggi accanto al titolo della pagina. La shell sta predisponendo un’area dedicata sotto la testata: quando sarà pronta il </w:t>
+            </w:r>
+            <w:r>
+              <w:rPr>
+                <w:sz w:val="17"/>
+                <w:lang w:val="it-IT"/>
+              </w:rPr>
+              <w:lastRenderedPageBreak/>
+              <w:t>distintivo vi si trasferirà, e con esso ogni altra informazione di contesto che oggi il micro-frontend disegna per conto proprio.</w:t>
             </w:r>
           </w:p>
         </w:tc>
@@ -35253,9 +35094,6 @@
               </w:rPr>
             </w:pPr>
             <w:r>
-              <w:rPr>
-                <w:b w:val="0"/>
-              </w:rPr>
               <w:t xml:space="preserve">La chiave di unicità adottata nell’analisi (versione, decodifica, valore ANSC, campo, data) ammette </w:t>
             </w:r>
             <w:r>
@@ -35265,9 +35103,6 @@
               <w:t>un solo valore di SIPO per ciascun valore di ANSC e campo</w:t>
             </w:r>
             <w:r>
-              <w:rPr>
-                <w:b w:val="0"/>
-              </w:rPr>
               <w:t>. ⚠️ Se in qualche decodifica esistessero due codici locali distinti da tradurre nello stesso valore — il caso tipico di un archivio stratificato, con un codice vecchio e uno nuovo — la maschera qui descritta non consentirebbe di dichiararlo. La verifica si fa sulle tabelle CONF_* raccordate; nell’analisi è il punto aperto OP-67.</w:t>
             </w:r>
           </w:p>
@@ -35283,8 +35118,8 @@
       </w:pPr>
     </w:p>
     <w:sectPr>
-      <w:headerReference w:type="default" r:id="rId33"/>
-      <w:footerReference w:type="default" r:id="rId34"/>
+      <w:headerReference w:type="default" r:id="rId34"/>
+      <w:footerReference w:type="default" r:id="rId35"/>
       <w:pgSz w:w="12240" w:h="15840"/>
       <w:pgMar w:top="1209" w:right="1440" w:bottom="1440" w:left="1440" w:header="454" w:footer="113" w:gutter="0"/>
       <w:cols w:space="708"/>
@@ -35736,7 +35571,7 @@
           <w:szCs w:val="16"/>
           <w:lang w:val="it-IT"/>
         </w:rPr>
-        <w:t>Questa ipotesi deve, infatti, essere suffragata durante una sessione tecnica.</w:t>
+        <w:t>Questione da approfondire nel documento di interfaccia</w:t>
       </w:r>
     </w:p>
   </w:footnote>
@@ -35766,49 +35601,19 @@
           <w:szCs w:val="16"/>
           <w:lang w:val="it-IT"/>
         </w:rPr>
-        <w:t>Questione da approfondire nel documento di interfaccia</w:t>
+        <w:t xml:space="preserve">Anche questo punto è da decidere principalmente </w:t>
+      </w:r>
+      <w:r>
+        <w:rPr>
+          <w:sz w:val="16"/>
+          <w:szCs w:val="16"/>
+          <w:lang w:val="it-IT"/>
+        </w:rPr>
+        <w:t>per le modalità organizzative e la relazione con i processi SIPO</w:t>
       </w:r>
     </w:p>
   </w:footnote>
   <w:footnote w:id="5">
-    <w:p>
-      <w:pPr>
-        <w:pStyle w:val="Testonotaapidipagina"/>
-        <w:rPr>
-          <w:lang w:val="it-IT"/>
-        </w:rPr>
-      </w:pPr>
-      <w:r>
-        <w:rPr>
-          <w:rStyle w:val="Rimandonotaapidipagina"/>
-        </w:rPr>
-        <w:footnoteRef/>
-      </w:r>
-      <w:r>
-        <w:rPr>
-          <w:lang w:val="it-IT"/>
-        </w:rPr>
-        <w:t xml:space="preserve"> </w:t>
-      </w:r>
-      <w:r>
-        <w:rPr>
-          <w:sz w:val="16"/>
-          <w:szCs w:val="16"/>
-          <w:lang w:val="it-IT"/>
-        </w:rPr>
-        <w:t xml:space="preserve">Anche questo punto è da decidere principalmente </w:t>
-      </w:r>
-      <w:r>
-        <w:rPr>
-          <w:sz w:val="16"/>
-          <w:szCs w:val="16"/>
-          <w:lang w:val="it-IT"/>
-        </w:rPr>
-        <w:t>per le modalità organizzative e la relazione con i processi SIPO</w:t>
-      </w:r>
-    </w:p>
-  </w:footnote>
-  <w:footnote w:id="6">
     <w:p>
       <w:pPr>
         <w:pStyle w:val="Testonotaapidipagina"/>
@@ -39665,10 +39470,6 @@
 </file>
 
 <file path=customXml/item1.xml><?xml version="1.0" encoding="utf-8"?>
-<b:Sources xmlns:b="http://schemas.openxmlformats.org/officeDocument/2006/bibliography" xmlns="http://schemas.openxmlformats.org/officeDocument/2006/bibliography" SelectedStyle="\APASixthEditionOfficeOnline.xsl" StyleName="APA" Version="6"/>
-</file>
-
-<file path=customXml/item2.xml><?xml version="1.0" encoding="utf-8"?>
 <?mso-contentType ?>
 <FormTemplates xmlns="http://schemas.microsoft.com/sharepoint/v3/contenttype/forms">
   <Display>DocumentLibraryForm</Display>
@@ -39677,7 +39478,17 @@
 </FormTemplates>
 </file>
 
+<file path=customXml/item2.xml><?xml version="1.0" encoding="utf-8"?>
+<b:Sources xmlns:b="http://schemas.openxmlformats.org/officeDocument/2006/bibliography" xmlns="http://schemas.openxmlformats.org/officeDocument/2006/bibliography" SelectedStyle="\APASixthEditionOfficeOnline.xsl" StyleName="APA" Version="6"/>
+</file>
+
 <file path=customXml/item3.xml><?xml version="1.0" encoding="utf-8"?>
+<p:properties xmlns:p="http://schemas.microsoft.com/office/2006/metadata/properties" xmlns:xsi="http://www.w3.org/2001/XMLSchema-instance" xmlns:pc="http://schemas.microsoft.com/office/infopath/2007/PartnerControls">
+  <documentManagement/>
+</p:properties>
+</file>
+
+<file path=customXml/item4.xml><?xml version="1.0" encoding="utf-8"?>
 <ct:contentTypeSchema xmlns:ct="http://schemas.microsoft.com/office/2006/metadata/contentType" xmlns:ma="http://schemas.microsoft.com/office/2006/metadata/properties/metaAttributes" ct:_="" ma:_="" ma:contentTypeName="Documento" ma:contentTypeID="0x0101000F70AD27AC816949BF7C819E6DFFF475" ma:contentTypeVersion="7" ma:contentTypeDescription="Creare un nuovo documento." ma:contentTypeScope="" ma:versionID="a3c63e874e08f7b0b0412d3283f410be">
   <xsd:schema xmlns:xsd="http://www.w3.org/2001/XMLSchema" xmlns:xs="http://www.w3.org/2001/XMLSchema" xmlns:p="http://schemas.microsoft.com/office/2006/metadata/properties" xmlns:ns2="320850a0-50f7-4a29-83a2-c11c7ba2e4a4" targetNamespace="http://schemas.microsoft.com/office/2006/metadata/properties" ma:root="true" ma:fieldsID="37eddf013746b268a4a345f63c84cd04" ns2:_="">
     <xsd:import namespace="320850a0-50f7-4a29-83a2-c11c7ba2e4a4"/>
@@ -39839,13 +39650,15 @@
 </ct:contentTypeSchema>
 </file>
 
-<file path=customXml/item4.xml><?xml version="1.0" encoding="utf-8"?>
-<p:properties xmlns:p="http://schemas.microsoft.com/office/2006/metadata/properties" xmlns:xsi="http://www.w3.org/2001/XMLSchema-instance" xmlns:pc="http://schemas.microsoft.com/office/infopath/2007/PartnerControls">
-  <documentManagement/>
-</p:properties>
+<file path=customXml/itemProps1.xml><?xml version="1.0" encoding="utf-8"?>
+<ds:datastoreItem xmlns:ds="http://schemas.openxmlformats.org/officeDocument/2006/customXml" ds:itemID="{F99C4A69-2199-4F0E-B095-005F11429EED}">
+  <ds:schemaRefs>
+    <ds:schemaRef ds:uri="http://schemas.microsoft.com/sharepoint/v3/contenttype/forms"/>
+  </ds:schemaRefs>
+</ds:datastoreItem>
 </file>
 
-<file path=customXml/itemProps1.xml><?xml version="1.0" encoding="utf-8"?>
+<file path=customXml/itemProps2.xml><?xml version="1.0" encoding="utf-8"?>
 <ds:datastoreItem xmlns:ds="http://schemas.openxmlformats.org/officeDocument/2006/customXml" ds:itemID="{BC6D8BCE-58E4-46C3-BADD-1867298A33AD}">
   <ds:schemaRefs>
     <ds:schemaRef ds:uri="http://schemas.openxmlformats.org/officeDocument/2006/bibliography"/>
@@ -39853,15 +39666,16 @@
 </ds:datastoreItem>
 </file>
 
-<file path=customXml/itemProps2.xml><?xml version="1.0" encoding="utf-8"?>
-<ds:datastoreItem xmlns:ds="http://schemas.openxmlformats.org/officeDocument/2006/customXml" ds:itemID="{F99C4A69-2199-4F0E-B095-005F11429EED}">
+<file path=customXml/itemProps3.xml><?xml version="1.0" encoding="utf-8"?>
+<ds:datastoreItem xmlns:ds="http://schemas.openxmlformats.org/officeDocument/2006/customXml" ds:itemID="{DE4C094D-D12A-45EF-90D1-D76D17B6E427}">
   <ds:schemaRefs>
-    <ds:schemaRef ds:uri="http://schemas.microsoft.com/sharepoint/v3/contenttype/forms"/>
+    <ds:schemaRef ds:uri="http://schemas.microsoft.com/office/2006/metadata/properties"/>
+    <ds:schemaRef ds:uri="http://schemas.microsoft.com/office/infopath/2007/PartnerControls"/>
   </ds:schemaRefs>
 </ds:datastoreItem>
 </file>
 
-<file path=customXml/itemProps3.xml><?xml version="1.0" encoding="utf-8"?>
+<file path=customXml/itemProps4.xml><?xml version="1.0" encoding="utf-8"?>
 <ds:datastoreItem xmlns:ds="http://schemas.openxmlformats.org/officeDocument/2006/customXml" ds:itemID="{B3715E09-15E7-413A-9BF3-994B1F4DCEA0}">
   <ds:schemaRefs>
     <ds:schemaRef ds:uri="http://schemas.microsoft.com/office/2006/metadata/contentType"/>
@@ -39879,15 +39693,6 @@
 </ds:datastoreItem>
 </file>
 
-<file path=customXml/itemProps4.xml><?xml version="1.0" encoding="utf-8"?>
-<ds:datastoreItem xmlns:ds="http://schemas.openxmlformats.org/officeDocument/2006/customXml" ds:itemID="{DE4C094D-D12A-45EF-90D1-D76D17B6E427}">
-  <ds:schemaRefs>
-    <ds:schemaRef ds:uri="http://schemas.microsoft.com/office/2006/metadata/properties"/>
-    <ds:schemaRef ds:uri="http://schemas.microsoft.com/office/infopath/2007/PartnerControls"/>
-  </ds:schemaRefs>
-</ds:datastoreItem>
-</file>
-
 <file path=docMetadata/LabelInfo.xml><?xml version="1.0" encoding="utf-8"?>
 <clbl:labelList xmlns:clbl="http://schemas.microsoft.com/office/2020/mipLabelMetadata">
   <clbl:label id="{512ef4a5-722f-43c9-bb21-7b09aace14b5}" enabled="0" method="" siteId="{512ef4a5-722f-43c9-bb21-7b09aace14b5}" removed="1"/>

</xml_diff>